<commit_message>
setting up admin vs employee stuff
</commit_message>
<xml_diff>
--- a/Managment task.docx
+++ b/Managment task.docx
@@ -628,11 +628,22 @@
       </w:pPr>
       <w:r>
         <w:rPr>
+          <w:rFonts w:ascii="Aptos" w:hAnsi="Aptos" w:eastAsia="Aptos" w:cs="Arial" w:asciiTheme="minorHAnsi" w:hAnsiTheme="minorHAnsi" w:eastAsiaTheme="minorHAnsi" w:csTheme="minorBidi"/>
+          <w:kern w:val="2"/>
+          <w:sz w:val="24"/>
+          <w:szCs w:val="24"/>
           <w:rtl/>
         </w:rPr>
         <w:t>الموظف يستطيع</w:t>
       </w:r>
       <w:r>
+        <w:rPr>
+          <w:rFonts w:ascii="Aptos" w:hAnsi="Aptos" w:eastAsia="Aptos" w:cs="Arial" w:asciiTheme="minorHAnsi" w:hAnsiTheme="minorHAnsi" w:eastAsiaTheme="minorHAnsi" w:csTheme="minorBidi"/>
+          <w:kern w:val="2"/>
+          <w:sz w:val="24"/>
+          <w:szCs w:val="24"/>
+          <w:shd w:val="clear" w:color="auto" w:fill="196B24"/>
+        </w:rPr>
         <w:t>:</w:t>
       </w:r>
     </w:p>
@@ -642,15 +653,28 @@
           <w:ilvl w:val="0"/>
           <w:numId w:val="2"/>
         </w:numPr>
-        <w:jc w:val="right"/>
-      </w:pPr>
-      <w:r>
-        <w:rPr>
+        <w:ind w:left="720" w:hanging="360"/>
+        <w:jc w:val="right"/>
+      </w:pPr>
+      <w:r>
+        <w:rPr>
+          <w:rFonts w:ascii="Aptos" w:hAnsi="Aptos" w:eastAsia="Aptos" w:cs="Arial" w:asciiTheme="minorHAnsi" w:hAnsiTheme="minorHAnsi" w:eastAsiaTheme="minorHAnsi" w:csTheme="minorBidi"/>
+          <w:kern w:val="2"/>
+          <w:sz w:val="24"/>
+          <w:szCs w:val="24"/>
+          <w:shd w:val="clear" w:color="auto" w:fill="196B24"/>
           <w:rtl/>
         </w:rPr>
         <w:t>تسجيل الدخول</w:t>
       </w:r>
       <w:r>
+        <w:rPr>
+          <w:rFonts w:ascii="Aptos" w:hAnsi="Aptos" w:eastAsia="Aptos" w:cs="Arial" w:asciiTheme="minorHAnsi" w:hAnsiTheme="minorHAnsi" w:eastAsiaTheme="minorHAnsi" w:csTheme="minorBidi"/>
+          <w:kern w:val="2"/>
+          <w:sz w:val="24"/>
+          <w:szCs w:val="24"/>
+          <w:shd w:val="clear" w:color="auto" w:fill="196B24"/>
+        </w:rPr>
         <w:t xml:space="preserve">. </w:t>
       </w:r>
     </w:p>
@@ -660,15 +684,27 @@
           <w:ilvl w:val="0"/>
           <w:numId w:val="2"/>
         </w:numPr>
-        <w:jc w:val="right"/>
-      </w:pPr>
-      <w:r>
-        <w:rPr>
+        <w:ind w:left="720" w:hanging="360"/>
+        <w:jc w:val="right"/>
+      </w:pPr>
+      <w:r>
+        <w:rPr>
+          <w:rFonts w:ascii="Aptos" w:hAnsi="Aptos" w:eastAsia="Aptos" w:cs="Arial" w:asciiTheme="minorHAnsi" w:hAnsiTheme="minorHAnsi" w:eastAsiaTheme="minorHAnsi" w:csTheme="minorBidi"/>
+          <w:kern w:val="2"/>
+          <w:sz w:val="24"/>
+          <w:szCs w:val="24"/>
+          <w:shd w:val="clear" w:color="auto" w:fill="196B24"/>
           <w:rtl/>
         </w:rPr>
         <w:t>مشاهدة بياناته الشخصية</w:t>
       </w:r>
       <w:r>
+        <w:rPr>
+          <w:rFonts w:ascii="Aptos" w:hAnsi="Aptos" w:eastAsia="Aptos" w:cs="Arial" w:asciiTheme="minorHAnsi" w:hAnsiTheme="minorHAnsi" w:eastAsiaTheme="minorHAnsi" w:csTheme="minorBidi"/>
+          <w:kern w:val="2"/>
+          <w:sz w:val="24"/>
+          <w:szCs w:val="24"/>
+        </w:rPr>
         <w:t xml:space="preserve">. </w:t>
       </w:r>
     </w:p>

</xml_diff>